<commit_message>
Move manuscript figures inline instead of batching them at the end
Each figure now sits right after the paragraph that discusses it, in the
same numeric order it's first cited (renumbered the choropleth map from
Figure 6 to Figure 3 since it's discussed alongside Figure 2).
</commit_message>
<xml_diff>
--- a/paper/Bangladesh_HPAI_Manuscript.docx
+++ b/paper/Bangladesh_HPAI_Manuscript.docx
@@ -502,6 +502,59 @@
     </w:p>
     <w:p>
       <w:pPr>
+        <w:jc w:val="center"/>
+      </w:pPr>
+      <w:r>
+        <w:drawing>
+          <wp:inline xmlns:a="http://schemas.openxmlformats.org/drawingml/2006/main" xmlns:pic="http://schemas.openxmlformats.org/drawingml/2006/picture">
+            <wp:extent cx="5029200" cy="1167536"/>
+            <wp:docPr id="1" name="Picture 1"/>
+            <wp:cNvGraphicFramePr>
+              <a:graphicFrameLocks noChangeAspect="1"/>
+            </wp:cNvGraphicFramePr>
+            <a:graphic>
+              <a:graphicData uri="http://schemas.openxmlformats.org/drawingml/2006/picture">
+                <pic:pic>
+                  <pic:nvPicPr>
+                    <pic:cNvPr id="0" name="fig1_semester_status_timeline.png"/>
+                    <pic:cNvPicPr/>
+                  </pic:nvPicPr>
+                  <pic:blipFill>
+                    <a:blip r:embed="rId9"/>
+                    <a:stretch>
+                      <a:fillRect/>
+                    </a:stretch>
+                  </pic:blipFill>
+                  <pic:spPr>
+                    <a:xfrm>
+                      <a:off x="0" y="0"/>
+                      <a:ext cx="5029200" cy="1167536"/>
+                    </a:xfrm>
+                    <a:prstGeom prst="rect"/>
+                  </pic:spPr>
+                </pic:pic>
+              </a:graphicData>
+            </a:graphic>
+          </wp:inline>
+        </w:drawing>
+      </w:r>
+    </w:p>
+    <w:p>
+      <w:pPr>
+        <w:spacing w:after="240"/>
+        <w:jc w:val="center"/>
+      </w:pPr>
+      <w:r>
+        <w:rPr>
+          <w:rFonts w:ascii="Times New Roman" w:hAnsi="Times New Roman"/>
+          <w:i/>
+          <w:sz w:val="20"/>
+        </w:rPr>
+        <w:t>Figure 1. HPAI reporting status in Bangladesh by six-month semester, 2007-2025 (WAHIS country reports; poultry and non-poultry/wild-bird listings shown separately). No rows exist for 2021-2022 (blank, not 'no information'). Source: WAHIS.</w:t>
+      </w:r>
+    </w:p>
+    <w:p>
+      <w:pPr>
         <w:pStyle w:val="Heading2"/>
         <w:jc w:val="left"/>
       </w:pPr>
@@ -527,7 +580,7 @@
           <w:i w:val="0"/>
           <w:sz w:val="24"/>
         </w:rPr>
-        <w:t>A total of 564 new HPAI outbreaks were reported across Bangladesh's administrative divisions from 2007 to 2025 (Table 1, Figures 2 and 6). Dhaka division accounted for the largest share (266 outbreaks, 47.2% of the national total; 267 including the single 2025 event resolved to Narayanganj Sadar), followed by Rajshahi (131, 23.2%) and Chittagong (81, 14.4%). Barisal (31), Khulna (40), Rangpur (10), and Sylhet (4) each recorded substantially lower burdens. Across all divisions, WAHIS records show 465,003 susceptible-animal cases, 2,391,300 birds killed and disposed of under control measures, and 447,872 recorded deaths.</w:t>
+        <w:t>A total of 564 new HPAI outbreaks were reported across Bangladesh's administrative divisions from 2007 to 2025 (Table 1, Figures 2 and 3). Dhaka division accounted for the largest share (266 outbreaks, 47.2% of the national total; 267 including the single 2025 event resolved to Narayanganj Sadar), followed by Rajshahi (131, 23.2%) and Chittagong (81, 14.4%). Barisal (31), Khulna (40), Rangpur (10), and Sylhet (4) each recorded substantially lower burdens. Across all divisions, WAHIS records show 465,003 susceptible-animal cases, 2,391,300 birds killed and disposed of under control measures, and 447,872 recorded deaths.</w:t>
       </w:r>
     </w:p>
     <w:p>
@@ -1490,6 +1543,112 @@
     <w:p/>
     <w:p>
       <w:pPr>
+        <w:jc w:val="center"/>
+      </w:pPr>
+      <w:r>
+        <w:drawing>
+          <wp:inline xmlns:a="http://schemas.openxmlformats.org/drawingml/2006/main" xmlns:pic="http://schemas.openxmlformats.org/drawingml/2006/picture">
+            <wp:extent cx="5029200" cy="2766154"/>
+            <wp:docPr id="2" name="Picture 2"/>
+            <wp:cNvGraphicFramePr>
+              <a:graphicFrameLocks noChangeAspect="1"/>
+            </wp:cNvGraphicFramePr>
+            <a:graphic>
+              <a:graphicData uri="http://schemas.openxmlformats.org/drawingml/2006/picture">
+                <pic:pic>
+                  <pic:nvPicPr>
+                    <pic:cNvPr id="0" name="fig2_division_outbreak_burden.png"/>
+                    <pic:cNvPicPr/>
+                  </pic:nvPicPr>
+                  <pic:blipFill>
+                    <a:blip r:embed="rId10"/>
+                    <a:stretch>
+                      <a:fillRect/>
+                    </a:stretch>
+                  </pic:blipFill>
+                  <pic:spPr>
+                    <a:xfrm>
+                      <a:off x="0" y="0"/>
+                      <a:ext cx="5029200" cy="2766154"/>
+                    </a:xfrm>
+                    <a:prstGeom prst="rect"/>
+                  </pic:spPr>
+                </pic:pic>
+              </a:graphicData>
+            </a:graphic>
+          </wp:inline>
+        </w:drawing>
+      </w:r>
+    </w:p>
+    <w:p>
+      <w:pPr>
+        <w:spacing w:after="240"/>
+        <w:jc w:val="center"/>
+      </w:pPr>
+      <w:r>
+        <w:rPr>
+          <w:rFonts w:ascii="Times New Roman" w:hAnsi="Times New Roman"/>
+          <w:i/>
+          <w:sz w:val="20"/>
+        </w:rPr>
+        <w:t>Figure 2. Total reported HPAI outbreaks by administrative division, Bangladesh, 2007-2025. Source: WAHIS event-level quantitative data.</w:t>
+      </w:r>
+    </w:p>
+    <w:p>
+      <w:pPr>
+        <w:jc w:val="center"/>
+      </w:pPr>
+      <w:r>
+        <w:drawing>
+          <wp:inline xmlns:a="http://schemas.openxmlformats.org/drawingml/2006/main" xmlns:pic="http://schemas.openxmlformats.org/drawingml/2006/picture">
+            <wp:extent cx="4114800" cy="5021260"/>
+            <wp:docPr id="3" name="Picture 3"/>
+            <wp:cNvGraphicFramePr>
+              <a:graphicFrameLocks noChangeAspect="1"/>
+            </wp:cNvGraphicFramePr>
+            <a:graphic>
+              <a:graphicData uri="http://schemas.openxmlformats.org/drawingml/2006/picture">
+                <pic:pic>
+                  <pic:nvPicPr>
+                    <pic:cNvPr id="0" name="fig6_division_choropleth_map.png"/>
+                    <pic:cNvPicPr/>
+                  </pic:nvPicPr>
+                  <pic:blipFill>
+                    <a:blip r:embed="rId11"/>
+                    <a:stretch>
+                      <a:fillRect/>
+                    </a:stretch>
+                  </pic:blipFill>
+                  <pic:spPr>
+                    <a:xfrm>
+                      <a:off x="0" y="0"/>
+                      <a:ext cx="4114800" cy="5021260"/>
+                    </a:xfrm>
+                    <a:prstGeom prst="rect"/>
+                  </pic:spPr>
+                </pic:pic>
+              </a:graphicData>
+            </a:graphic>
+          </wp:inline>
+        </w:drawing>
+      </w:r>
+    </w:p>
+    <w:p>
+      <w:pPr>
+        <w:spacing w:after="240"/>
+        <w:jc w:val="center"/>
+      </w:pPr>
+      <w:r>
+        <w:rPr>
+          <w:rFonts w:ascii="Times New Roman" w:hAnsi="Times New Roman"/>
+          <w:i/>
+          <w:sz w:val="20"/>
+        </w:rPr>
+        <w:t>Figure 3. Choropleth map of total reported HPAI outbreaks by administrative division, Bangladesh, 2007-2025. Boundary: geoBoundaries ADM1, dissolved to WAHIS's 7-division scheme (Mymensingh merged into Dhaka). Source: WAHIS; geoBoundaries.</w:t>
+      </w:r>
+    </w:p>
+    <w:p>
+      <w:pPr>
         <w:pStyle w:val="Heading2"/>
         <w:jc w:val="left"/>
       </w:pPr>
@@ -1545,7 +1704,60 @@
           <w:i w:val="0"/>
           <w:sz w:val="24"/>
         </w:rPr>
-        <w:t>The great majority of reported cases involved domestic poultry (species 'Birds'). Wild-species detections were first recorded in the WAHIS quantitative-data export in 2016: House Crow (Corvus splendens) in Rajshahi, Dhaka, and Khulna divisions across five reporting semesters between 2016 and 2019 (40 to 166 cases per semester), and unidentified Phasianidae in Dhaka in early 2018 (600 cases) (Figure 3). The most recent WAHIS event for Bangladesh (event ID 6453, confirmed 2025/04/21) reports H5N1 in a captive Serval (Leptailurus serval) at Siddirgonj Thana, Narayanganj Sadar, Dhaka division (23.64696N, 90.512087E; approximate location), with the reason for notification recorded as 'unusual host species.' Both susceptible animals were confirmed as cases and both died. The animal category was recorded as 'WILD Captive', indicating a captive-wildlife setting rather than a free-ranging detection.</w:t>
+        <w:t>The great majority of reported cases involved domestic poultry (species 'Birds'). Wild-species detections were first recorded in the WAHIS quantitative-data export in 2016: House Crow (Corvus splendens) in Rajshahi, Dhaka, and Khulna divisions across five reporting semesters between 2016 and 2019 (40 to 166 cases per semester), and unidentified Phasianidae in Dhaka in early 2018 (600 cases) (Figure 4). The most recent WAHIS event for Bangladesh (event ID 6453, confirmed 2025/04/21) reports H5N1 in a captive Serval (Leptailurus serval) at Siddirgonj Thana, Narayanganj Sadar, Dhaka division (23.64696N, 90.512087E; approximate location), with the reason for notification recorded as 'unusual host species.' Both susceptible animals were confirmed as cases and both died. The animal category was recorded as 'WILD Captive', indicating a captive-wildlife setting rather than a free-ranging detection.</w:t>
+      </w:r>
+    </w:p>
+    <w:p>
+      <w:pPr>
+        <w:jc w:val="center"/>
+      </w:pPr>
+      <w:r>
+        <w:drawing>
+          <wp:inline xmlns:a="http://schemas.openxmlformats.org/drawingml/2006/main" xmlns:pic="http://schemas.openxmlformats.org/drawingml/2006/picture">
+            <wp:extent cx="5029200" cy="3099112"/>
+            <wp:docPr id="4" name="Picture 4"/>
+            <wp:cNvGraphicFramePr>
+              <a:graphicFrameLocks noChangeAspect="1"/>
+            </wp:cNvGraphicFramePr>
+            <a:graphic>
+              <a:graphicData uri="http://schemas.openxmlformats.org/drawingml/2006/picture">
+                <pic:pic>
+                  <pic:nvPicPr>
+                    <pic:cNvPr id="0" name="fig3_species_spillover_timeline.png"/>
+                    <pic:cNvPicPr/>
+                  </pic:nvPicPr>
+                  <pic:blipFill>
+                    <a:blip r:embed="rId12"/>
+                    <a:stretch>
+                      <a:fillRect/>
+                    </a:stretch>
+                  </pic:blipFill>
+                  <pic:spPr>
+                    <a:xfrm>
+                      <a:off x="0" y="0"/>
+                      <a:ext cx="5029200" cy="3099112"/>
+                    </a:xfrm>
+                    <a:prstGeom prst="rect"/>
+                  </pic:spPr>
+                </pic:pic>
+              </a:graphicData>
+            </a:graphic>
+          </wp:inline>
+        </w:drawing>
+      </w:r>
+    </w:p>
+    <w:p>
+      <w:pPr>
+        <w:spacing w:after="240"/>
+        <w:jc w:val="center"/>
+      </w:pPr>
+      <w:r>
+        <w:rPr>
+          <w:rFonts w:ascii="Times New Roman" w:hAnsi="Times New Roman"/>
+          <w:i/>
+          <w:sz w:val="20"/>
+        </w:rPr>
+        <w:t>Figure 4. HPAI cases in Bangladesh by species and semester, 2007-2025. Top panel: domestic poultry cases (national total per semester). Bottom panel: wild-species detections (House Crow, Phasianidae, and the 2025 captive Serval), marker size proportional to reported cases. Source: WAHIS.</w:t>
       </w:r>
     </w:p>
     <w:p>
@@ -1575,7 +1787,60 @@
           <w:i w:val="0"/>
           <w:sz w:val="24"/>
         </w:rPr>
-        <w:t>WAHIS tracks Bangladesh's 2007-2013 HPAI poultry epidemic as a single event (ID 192) followed by 46 individual reports between 30 March 2007 and 21 December 2013, cumulatively reaching 549 outbreaks -- the great majority of the 2007-2013 national total. Reconstructing the epidemic curve at this report-level resolution, rather than the coarser six-month semester bins used elsewhere in this analysis, reveals two distinct peaks rather than one continuous wave (Figure 4): a sharp spike of 156 new outbreaks reported in April 2008, and a second, smaller peak of 67 new outbreaks in March 2011, separated by a comparatively quiet 2009-2010 period. This structure is not visible in the semester-aggregated data used for the division- and seasonal-level analyses (Sections 3.2, 3.6).</w:t>
+        <w:t>WAHIS tracks Bangladesh's 2007-2013 HPAI poultry epidemic as a single event (ID 192) followed by 46 individual reports between 30 March 2007 and 21 December 2013, cumulatively reaching 549 outbreaks -- the great majority of the 2007-2013 national total. Reconstructing the epidemic curve at this report-level resolution, rather than the coarser six-month semester bins used elsewhere in this analysis, reveals two distinct peaks rather than one continuous wave (Figure 5): a sharp spike of 156 new outbreaks reported in April 2008, and a second, smaller peak of 67 new outbreaks in March 2011, separated by a comparatively quiet 2009-2010 period. This structure is not visible in the semester-aggregated data used for the division- and seasonal-level analyses (Sections 3.2, 3.6).</w:t>
+      </w:r>
+    </w:p>
+    <w:p>
+      <w:pPr>
+        <w:jc w:val="center"/>
+      </w:pPr>
+      <w:r>
+        <w:drawing>
+          <wp:inline xmlns:a="http://schemas.openxmlformats.org/drawingml/2006/main" xmlns:pic="http://schemas.openxmlformats.org/drawingml/2006/picture">
+            <wp:extent cx="5029200" cy="2960858"/>
+            <wp:docPr id="5" name="Picture 5"/>
+            <wp:cNvGraphicFramePr>
+              <a:graphicFrameLocks noChangeAspect="1"/>
+            </wp:cNvGraphicFramePr>
+            <a:graphic>
+              <a:graphicData uri="http://schemas.openxmlformats.org/drawingml/2006/picture">
+                <pic:pic>
+                  <pic:nvPicPr>
+                    <pic:cNvPr id="0" name="fig4_event192_epidemic_curve.png"/>
+                    <pic:cNvPicPr/>
+                  </pic:nvPicPr>
+                  <pic:blipFill>
+                    <a:blip r:embed="rId13"/>
+                    <a:stretch>
+                      <a:fillRect/>
+                    </a:stretch>
+                  </pic:blipFill>
+                  <pic:spPr>
+                    <a:xfrm>
+                      <a:off x="0" y="0"/>
+                      <a:ext cx="5029200" cy="2960858"/>
+                    </a:xfrm>
+                    <a:prstGeom prst="rect"/>
+                  </pic:spPr>
+                </pic:pic>
+              </a:graphicData>
+            </a:graphic>
+          </wp:inline>
+        </w:drawing>
+      </w:r>
+    </w:p>
+    <w:p>
+      <w:pPr>
+        <w:spacing w:after="240"/>
+        <w:jc w:val="center"/>
+      </w:pPr>
+      <w:r>
+        <w:rPr>
+          <w:rFonts w:ascii="Times New Roman" w:hAnsi="Times New Roman"/>
+          <w:i/>
+          <w:sz w:val="20"/>
+        </w:rPr>
+        <w:t>Figure 5. Report-level epidemic curve of the 2007-2013 HPAI poultry wave (WAHIS event 192), reconstructed from 46 individual follow-up reports. Top: new outbreaks per report. Bottom: cumulative outbreaks. Two peaks are visible (April 2008, March 2011) that are not distinguishable in semester-aggregated data. Source: WAHIS.</w:t>
       </w:r>
     </w:p>
     <w:p>
@@ -1605,7 +1870,7 @@
           <w:i w:val="0"/>
           <w:sz w:val="24"/>
         </w:rPr>
-        <w:t>Outbreak occurrence was strongly concentrated in the January-June semester: 525 of 563 division-resolved outbreaks (93.3%) fell in this dry/cool period, versus 38 (6.7%) in July-December (Table 2b). Mean relative humidity was correspondingly lower in outbreak-heavy semesters (66.1% in January-June versus 84.1% in July-December) and mean precipitation substantially lower (986 mm versus 1,626 mm); mean temperature differed only marginally between the two halves of the year (25.6 degC versus 25.3 degC) despite the regression finding a significant temperature association (Section 3.7), indicating the temperature coefficient should be interpreted as part of a correlated climate signal rather than in isolation (Section 4.5). Raw Pearson correlations with semester-level outbreak counts were r = -0.21 for humidity and r = -0.19 for precipitation (Table 2, Figure 5).</w:t>
+        <w:t>Outbreak occurrence was strongly concentrated in the January-June semester: 525 of 563 division-resolved outbreaks (93.3%) fell in this dry/cool period, versus 38 (6.7%) in July-December (Table 2b). Mean relative humidity was correspondingly lower in outbreak-heavy semesters (66.1% in January-June versus 84.1% in July-December) and mean precipitation substantially lower (986 mm versus 1,626 mm); mean temperature differed only marginally between the two halves of the year (25.6 degC versus 25.3 degC) despite the regression finding a significant temperature association (Section 3.7), indicating the temperature coefficient should be interpreted as part of a correlated climate signal rather than in isolation (Section 4.5). Raw Pearson correlations with semester-level outbreak counts were r = -0.21 for humidity and r = -0.19 for precipitation (Table 2, Figure 6).</w:t>
       </w:r>
     </w:p>
     <w:p>
@@ -1791,6 +2056,59 @@
       </w:tr>
     </w:tbl>
     <w:p/>
+    <w:p>
+      <w:pPr>
+        <w:jc w:val="center"/>
+      </w:pPr>
+      <w:r>
+        <w:drawing>
+          <wp:inline xmlns:a="http://schemas.openxmlformats.org/drawingml/2006/main" xmlns:pic="http://schemas.openxmlformats.org/drawingml/2006/picture">
+            <wp:extent cx="5029200" cy="3047658"/>
+            <wp:docPr id="6" name="Picture 6"/>
+            <wp:cNvGraphicFramePr>
+              <a:graphicFrameLocks noChangeAspect="1"/>
+            </wp:cNvGraphicFramePr>
+            <a:graphic>
+              <a:graphicData uri="http://schemas.openxmlformats.org/drawingml/2006/picture">
+                <pic:pic>
+                  <pic:nvPicPr>
+                    <pic:cNvPr id="0" name="fig5_climate_seasonality.png"/>
+                    <pic:cNvPicPr/>
+                  </pic:nvPicPr>
+                  <pic:blipFill>
+                    <a:blip r:embed="rId14"/>
+                    <a:stretch>
+                      <a:fillRect/>
+                    </a:stretch>
+                  </pic:blipFill>
+                  <pic:spPr>
+                    <a:xfrm>
+                      <a:off x="0" y="0"/>
+                      <a:ext cx="5029200" cy="3047658"/>
+                    </a:xfrm>
+                    <a:prstGeom prst="rect"/>
+                  </pic:spPr>
+                </pic:pic>
+              </a:graphicData>
+            </a:graphic>
+          </wp:inline>
+        </w:drawing>
+      </w:r>
+    </w:p>
+    <w:p>
+      <w:pPr>
+        <w:spacing w:after="240"/>
+        <w:jc w:val="center"/>
+      </w:pPr>
+      <w:r>
+        <w:rPr>
+          <w:rFonts w:ascii="Times New Roman" w:hAnsi="Times New Roman"/>
+          <w:i/>
+          <w:sz w:val="20"/>
+        </w:rPr>
+        <w:t>Figure 6. HPAI outbreaks by division-semester against mean relative humidity, coloured by dry/cool (Jan-Jun) versus monsoon/warm (Jul-Dec) semester. Outbreaks concentrate below approximately 75% mean relative humidity. Source: WAHIS outbreak counts; NASA POWER climate.</w:t>
+      </w:r>
+    </w:p>
     <w:p>
       <w:pPr>
         <w:pStyle w:val="Heading2"/>
@@ -3188,349 +3506,6 @@
         <w:t>[10] WOAH. World Animal Health Information System (WAHIS). Available at: https://wahis.woah.org. Accessed August 2026.</w:t>
       </w:r>
     </w:p>
-    <w:p>
-      <w:r>
-        <w:br w:type="page"/>
-      </w:r>
-    </w:p>
-    <w:p>
-      <w:pPr>
-        <w:pStyle w:val="Heading1"/>
-        <w:jc w:val="left"/>
-      </w:pPr>
-      <w:r>
-        <w:rPr>
-          <w:rFonts w:ascii="Times New Roman" w:hAnsi="Times New Roman"/>
-          <w:b/>
-          <w:sz w:val="26"/>
-        </w:rPr>
-        <w:t>Figures</w:t>
-      </w:r>
-    </w:p>
-    <w:p>
-      <w:pPr>
-        <w:jc w:val="center"/>
-      </w:pPr>
-      <w:r>
-        <w:drawing>
-          <wp:inline xmlns:a="http://schemas.openxmlformats.org/drawingml/2006/main" xmlns:pic="http://schemas.openxmlformats.org/drawingml/2006/picture">
-            <wp:extent cx="5029200" cy="1167536"/>
-            <wp:docPr id="1" name="Picture 1"/>
-            <wp:cNvGraphicFramePr>
-              <a:graphicFrameLocks noChangeAspect="1"/>
-            </wp:cNvGraphicFramePr>
-            <a:graphic>
-              <a:graphicData uri="http://schemas.openxmlformats.org/drawingml/2006/picture">
-                <pic:pic>
-                  <pic:nvPicPr>
-                    <pic:cNvPr id="0" name="fig1_semester_status_timeline.png"/>
-                    <pic:cNvPicPr/>
-                  </pic:nvPicPr>
-                  <pic:blipFill>
-                    <a:blip r:embed="rId9"/>
-                    <a:stretch>
-                      <a:fillRect/>
-                    </a:stretch>
-                  </pic:blipFill>
-                  <pic:spPr>
-                    <a:xfrm>
-                      <a:off x="0" y="0"/>
-                      <a:ext cx="5029200" cy="1167536"/>
-                    </a:xfrm>
-                    <a:prstGeom prst="rect"/>
-                  </pic:spPr>
-                </pic:pic>
-              </a:graphicData>
-            </a:graphic>
-          </wp:inline>
-        </w:drawing>
-      </w:r>
-    </w:p>
-    <w:p>
-      <w:pPr>
-        <w:spacing w:after="240"/>
-        <w:jc w:val="center"/>
-      </w:pPr>
-      <w:r>
-        <w:rPr>
-          <w:rFonts w:ascii="Times New Roman" w:hAnsi="Times New Roman"/>
-          <w:i/>
-          <w:sz w:val="20"/>
-        </w:rPr>
-        <w:t>Figure 1. HPAI reporting status in Bangladesh by six-month semester, 2007-2025 (WAHIS country reports; poultry and non-poultry/wild-bird listings shown separately). No rows exist for 2021-2022 (blank, not 'no information'). Source: WAHIS.</w:t>
-      </w:r>
-    </w:p>
-    <w:p/>
-    <w:p>
-      <w:pPr>
-        <w:jc w:val="center"/>
-      </w:pPr>
-      <w:r>
-        <w:drawing>
-          <wp:inline xmlns:a="http://schemas.openxmlformats.org/drawingml/2006/main" xmlns:pic="http://schemas.openxmlformats.org/drawingml/2006/picture">
-            <wp:extent cx="5029200" cy="2766154"/>
-            <wp:docPr id="2" name="Picture 2"/>
-            <wp:cNvGraphicFramePr>
-              <a:graphicFrameLocks noChangeAspect="1"/>
-            </wp:cNvGraphicFramePr>
-            <a:graphic>
-              <a:graphicData uri="http://schemas.openxmlformats.org/drawingml/2006/picture">
-                <pic:pic>
-                  <pic:nvPicPr>
-                    <pic:cNvPr id="0" name="fig2_division_outbreak_burden.png"/>
-                    <pic:cNvPicPr/>
-                  </pic:nvPicPr>
-                  <pic:blipFill>
-                    <a:blip r:embed="rId10"/>
-                    <a:stretch>
-                      <a:fillRect/>
-                    </a:stretch>
-                  </pic:blipFill>
-                  <pic:spPr>
-                    <a:xfrm>
-                      <a:off x="0" y="0"/>
-                      <a:ext cx="5029200" cy="2766154"/>
-                    </a:xfrm>
-                    <a:prstGeom prst="rect"/>
-                  </pic:spPr>
-                </pic:pic>
-              </a:graphicData>
-            </a:graphic>
-          </wp:inline>
-        </w:drawing>
-      </w:r>
-    </w:p>
-    <w:p>
-      <w:pPr>
-        <w:spacing w:after="240"/>
-        <w:jc w:val="center"/>
-      </w:pPr>
-      <w:r>
-        <w:rPr>
-          <w:rFonts w:ascii="Times New Roman" w:hAnsi="Times New Roman"/>
-          <w:i/>
-          <w:sz w:val="20"/>
-        </w:rPr>
-        <w:t>Figure 2. Total reported HPAI outbreaks by administrative division, Bangladesh, 2007-2025. Source: WAHIS event-level quantitative data.</w:t>
-      </w:r>
-    </w:p>
-    <w:p/>
-    <w:p>
-      <w:pPr>
-        <w:jc w:val="center"/>
-      </w:pPr>
-      <w:r>
-        <w:drawing>
-          <wp:inline xmlns:a="http://schemas.openxmlformats.org/drawingml/2006/main" xmlns:pic="http://schemas.openxmlformats.org/drawingml/2006/picture">
-            <wp:extent cx="5029200" cy="3099112"/>
-            <wp:docPr id="3" name="Picture 3"/>
-            <wp:cNvGraphicFramePr>
-              <a:graphicFrameLocks noChangeAspect="1"/>
-            </wp:cNvGraphicFramePr>
-            <a:graphic>
-              <a:graphicData uri="http://schemas.openxmlformats.org/drawingml/2006/picture">
-                <pic:pic>
-                  <pic:nvPicPr>
-                    <pic:cNvPr id="0" name="fig3_species_spillover_timeline.png"/>
-                    <pic:cNvPicPr/>
-                  </pic:nvPicPr>
-                  <pic:blipFill>
-                    <a:blip r:embed="rId11"/>
-                    <a:stretch>
-                      <a:fillRect/>
-                    </a:stretch>
-                  </pic:blipFill>
-                  <pic:spPr>
-                    <a:xfrm>
-                      <a:off x="0" y="0"/>
-                      <a:ext cx="5029200" cy="3099112"/>
-                    </a:xfrm>
-                    <a:prstGeom prst="rect"/>
-                  </pic:spPr>
-                </pic:pic>
-              </a:graphicData>
-            </a:graphic>
-          </wp:inline>
-        </w:drawing>
-      </w:r>
-    </w:p>
-    <w:p>
-      <w:pPr>
-        <w:spacing w:after="240"/>
-        <w:jc w:val="center"/>
-      </w:pPr>
-      <w:r>
-        <w:rPr>
-          <w:rFonts w:ascii="Times New Roman" w:hAnsi="Times New Roman"/>
-          <w:i/>
-          <w:sz w:val="20"/>
-        </w:rPr>
-        <w:t>Figure 3. HPAI cases in Bangladesh by species and semester, 2007-2025. Top panel: domestic poultry cases (national total per semester). Bottom panel: wild-species detections (House Crow, Phasianidae, and the 2025 captive Serval), marker size proportional to reported cases. Source: WAHIS.</w:t>
-      </w:r>
-    </w:p>
-    <w:p/>
-    <w:p>
-      <w:pPr>
-        <w:jc w:val="center"/>
-      </w:pPr>
-      <w:r>
-        <w:drawing>
-          <wp:inline xmlns:a="http://schemas.openxmlformats.org/drawingml/2006/main" xmlns:pic="http://schemas.openxmlformats.org/drawingml/2006/picture">
-            <wp:extent cx="5029200" cy="2960858"/>
-            <wp:docPr id="4" name="Picture 4"/>
-            <wp:cNvGraphicFramePr>
-              <a:graphicFrameLocks noChangeAspect="1"/>
-            </wp:cNvGraphicFramePr>
-            <a:graphic>
-              <a:graphicData uri="http://schemas.openxmlformats.org/drawingml/2006/picture">
-                <pic:pic>
-                  <pic:nvPicPr>
-                    <pic:cNvPr id="0" name="fig4_event192_epidemic_curve.png"/>
-                    <pic:cNvPicPr/>
-                  </pic:nvPicPr>
-                  <pic:blipFill>
-                    <a:blip r:embed="rId12"/>
-                    <a:stretch>
-                      <a:fillRect/>
-                    </a:stretch>
-                  </pic:blipFill>
-                  <pic:spPr>
-                    <a:xfrm>
-                      <a:off x="0" y="0"/>
-                      <a:ext cx="5029200" cy="2960858"/>
-                    </a:xfrm>
-                    <a:prstGeom prst="rect"/>
-                  </pic:spPr>
-                </pic:pic>
-              </a:graphicData>
-            </a:graphic>
-          </wp:inline>
-        </w:drawing>
-      </w:r>
-    </w:p>
-    <w:p>
-      <w:pPr>
-        <w:spacing w:after="240"/>
-        <w:jc w:val="center"/>
-      </w:pPr>
-      <w:r>
-        <w:rPr>
-          <w:rFonts w:ascii="Times New Roman" w:hAnsi="Times New Roman"/>
-          <w:i/>
-          <w:sz w:val="20"/>
-        </w:rPr>
-        <w:t>Figure 4. Report-level epidemic curve of the 2007-2013 HPAI poultry wave (WAHIS event 192), reconstructed from 46 individual follow-up reports. Top: new outbreaks per report. Bottom: cumulative outbreaks. Two peaks are visible (April 2008, March 2011) that are not distinguishable in semester-aggregated data. Source: WAHIS.</w:t>
-      </w:r>
-    </w:p>
-    <w:p/>
-    <w:p>
-      <w:pPr>
-        <w:jc w:val="center"/>
-      </w:pPr>
-      <w:r>
-        <w:drawing>
-          <wp:inline xmlns:a="http://schemas.openxmlformats.org/drawingml/2006/main" xmlns:pic="http://schemas.openxmlformats.org/drawingml/2006/picture">
-            <wp:extent cx="5029200" cy="3047658"/>
-            <wp:docPr id="5" name="Picture 5"/>
-            <wp:cNvGraphicFramePr>
-              <a:graphicFrameLocks noChangeAspect="1"/>
-            </wp:cNvGraphicFramePr>
-            <a:graphic>
-              <a:graphicData uri="http://schemas.openxmlformats.org/drawingml/2006/picture">
-                <pic:pic>
-                  <pic:nvPicPr>
-                    <pic:cNvPr id="0" name="fig5_climate_seasonality.png"/>
-                    <pic:cNvPicPr/>
-                  </pic:nvPicPr>
-                  <pic:blipFill>
-                    <a:blip r:embed="rId13"/>
-                    <a:stretch>
-                      <a:fillRect/>
-                    </a:stretch>
-                  </pic:blipFill>
-                  <pic:spPr>
-                    <a:xfrm>
-                      <a:off x="0" y="0"/>
-                      <a:ext cx="5029200" cy="3047658"/>
-                    </a:xfrm>
-                    <a:prstGeom prst="rect"/>
-                  </pic:spPr>
-                </pic:pic>
-              </a:graphicData>
-            </a:graphic>
-          </wp:inline>
-        </w:drawing>
-      </w:r>
-    </w:p>
-    <w:p>
-      <w:pPr>
-        <w:spacing w:after="240"/>
-        <w:jc w:val="center"/>
-      </w:pPr>
-      <w:r>
-        <w:rPr>
-          <w:rFonts w:ascii="Times New Roman" w:hAnsi="Times New Roman"/>
-          <w:i/>
-          <w:sz w:val="20"/>
-        </w:rPr>
-        <w:t>Figure 5. HPAI outbreaks by division-semester against mean relative humidity, coloured by dry/cool (Jan-Jun) versus monsoon/warm (Jul-Dec) semester. Outbreaks concentrate below approximately 75% mean relative humidity. Source: WAHIS outbreak counts; NASA POWER climate.</w:t>
-      </w:r>
-    </w:p>
-    <w:p/>
-    <w:p>
-      <w:pPr>
-        <w:jc w:val="center"/>
-      </w:pPr>
-      <w:r>
-        <w:drawing>
-          <wp:inline xmlns:a="http://schemas.openxmlformats.org/drawingml/2006/main" xmlns:pic="http://schemas.openxmlformats.org/drawingml/2006/picture">
-            <wp:extent cx="5029200" cy="6137095"/>
-            <wp:docPr id="6" name="Picture 6"/>
-            <wp:cNvGraphicFramePr>
-              <a:graphicFrameLocks noChangeAspect="1"/>
-            </wp:cNvGraphicFramePr>
-            <a:graphic>
-              <a:graphicData uri="http://schemas.openxmlformats.org/drawingml/2006/picture">
-                <pic:pic>
-                  <pic:nvPicPr>
-                    <pic:cNvPr id="0" name="fig6_division_choropleth_map.png"/>
-                    <pic:cNvPicPr/>
-                  </pic:nvPicPr>
-                  <pic:blipFill>
-                    <a:blip r:embed="rId14"/>
-                    <a:stretch>
-                      <a:fillRect/>
-                    </a:stretch>
-                  </pic:blipFill>
-                  <pic:spPr>
-                    <a:xfrm>
-                      <a:off x="0" y="0"/>
-                      <a:ext cx="5029200" cy="6137095"/>
-                    </a:xfrm>
-                    <a:prstGeom prst="rect"/>
-                  </pic:spPr>
-                </pic:pic>
-              </a:graphicData>
-            </a:graphic>
-          </wp:inline>
-        </w:drawing>
-      </w:r>
-    </w:p>
-    <w:p>
-      <w:pPr>
-        <w:spacing w:after="240"/>
-        <w:jc w:val="center"/>
-      </w:pPr>
-      <w:r>
-        <w:rPr>
-          <w:rFonts w:ascii="Times New Roman" w:hAnsi="Times New Roman"/>
-          <w:i/>
-          <w:sz w:val="20"/>
-        </w:rPr>
-        <w:t>Figure 6. Choropleth map of total reported HPAI outbreaks by administrative division, Bangladesh, 2007-2025. Boundary: geoBoundaries ADM1, dissolved to WAHIS's 7-division scheme (Mymensingh merged into Dhaka). Source: WAHIS; geoBoundaries.</w:t>
-      </w:r>
-    </w:p>
-    <w:p/>
     <w:sectPr>
       <w:pgSz w:w="12240" w:h="15840"/>
       <w:pgMar w:top="1440" w:right="1440" w:bottom="1440" w:left="1440" w:header="720" w:footer="720" w:gutter="0"/>

</xml_diff>

<commit_message>
Verify all manuscript references
Confirmed the two Bangladesh HPAI citations (Biswas 2008, Loth 2010) were
exactly correct as written. The clade 2.3.4.4b spillover citation had an
invented author list and is replaced with a real, better-matched paper
(Coleman & Bemis 2025, feline-specific systematic review).
</commit_message>
<xml_diff>
--- a/paper/Bangladesh_HPAI_Manuscript.docx
+++ b/paper/Bangladesh_HPAI_Manuscript.docx
@@ -3363,7 +3363,7 @@
           <w:i/>
           <w:sz w:val="24"/>
         </w:rPr>
-        <w:t>NOTE TO AUTHOR: references [3], [4], and [8] below are cited from memory and MUST be independently verified (author names, year, volume/page, DOI) against the original sources before submission. References [1], [2], [5], [6], and [7] point to organizational/data sources used directly by this analysis pipeline and are safe to cite as-is.</w:t>
+        <w:t>All references below were verified via web search on 4 August 2026 (author names, year, volume/issue, page or article number, and DOI checked against the publisher or PubMed record). References [1], [2], [6], and [10] point to organizational/data sources used directly by this analysis pipeline.</w:t>
       </w:r>
     </w:p>
     <w:p>
@@ -3405,7 +3405,7 @@
           <w:rFonts w:ascii="Times New Roman" w:hAnsi="Times New Roman"/>
           <w:sz w:val="22"/>
         </w:rPr>
-        <w:t>[3] Biswas PK, Christensen JP, Ahmed SS, et al. Avian influenza outbreaks in chickens, Bangladesh. Emerging Infectious Diseases. 2008;14(12):1909-1912. [VERIFY BEFORE SUBMISSION]</w:t>
+        <w:t>[3] Biswas PK, Christensen JP, Ahmed SS, et al. Avian influenza outbreaks in chickens, Bangladesh. Emerging Infectious Diseases. 2008;14(12):1909-1912. doi:10.3201/eid1412.071567. PMID: 19046518.</w:t>
       </w:r>
     </w:p>
     <w:p>
@@ -3419,7 +3419,7 @@
           <w:rFonts w:ascii="Times New Roman" w:hAnsi="Times New Roman"/>
           <w:sz w:val="22"/>
         </w:rPr>
-        <w:t>[4] Loth L, Gilbert M, Osmani MG, Kalam AM, Xiao X. Risk factors and clusters of highly pathogenic avian influenza H5N1 outbreaks in Bangladesh. Preventive Veterinary Medicine. 2010;96(1-2):104-113. [VERIFY BEFORE SUBMISSION]</w:t>
+        <w:t>[4] Loth L, Gilbert M, Osmani MG, Kalam AM, Xiao X. Risk factors and clusters of highly pathogenic avian influenza H5N1 outbreaks in Bangladesh. Preventive Veterinary Medicine. 2010;96(1-2):104-113. PMID: 20554337.</w:t>
       </w:r>
     </w:p>
     <w:p>
@@ -3461,7 +3461,7 @@
           <w:rFonts w:ascii="Times New Roman" w:hAnsi="Times New Roman"/>
           <w:sz w:val="22"/>
         </w:rPr>
-        <w:t>[7] Gilbert M, Nicolas G, Cinardi G, et al. Global distribution data for cattle, buffaloes, horses, sheep, goats, pigs, chickens and ducks in 2010 (Gridded Livestock of the World). Scientific Data. 2018;5:180227. GLW4 (2020, 10km) accessed via FAO catalog: https://data.apps.fao.org [VERIFY GLW4-specific citation before submission]</w:t>
+        <w:t>[7] Gilbert M, Nicolas G, Cinardi G, et al. Global distribution data for cattle, buffaloes, horses, sheep, goats, pigs, chickens and ducks in 2010 (Gridded Livestock of the World methodology). Scientific Data. 2018;5:180227. doi:10.1038/sdata.2018.227. GLW4 (2020, 10km chicken layer) accessed via FAO catalog: https://data.apps.fao.org/catalog/iso/9d1e149b-d63f-4213-978b-317a8eb42d02</w:t>
       </w:r>
     </w:p>
     <w:p>
@@ -3475,7 +3475,7 @@
           <w:rFonts w:ascii="Times New Roman" w:hAnsi="Times New Roman"/>
           <w:sz w:val="22"/>
         </w:rPr>
-        <w:t>[8] Mostafa A, Naguib MM, Nogales A, et al. Avian influenza A(H5N1) virus clade 2.3.4.4b spillover into mammals. [VERIFY EXACT SOURCE, AUTHORS, YEAR BEFORE SUBMISSION -- cited from memory as general background on mammalian spillover of clade 2.3.4.4b.]</w:t>
+        <w:t>[8] Coleman KK, Bemis IG. Avian influenza virus infections in felines: a systematic review of two decades of literature. Open Forum Infectious Diseases. 2025;12(5):ofaf261. doi:10.1093/ofid/ofaf261</w:t>
       </w:r>
     </w:p>
     <w:p>

</xml_diff>